<commit_message>
Remove SPSS syntax appendix from seminar paper
Co-Authored-By: Claude Fable 5.1 <noreply@anthropic.com>
Claude-Session: https://claude.ai/code/session_01KHo5ZcKCUwhCAvyoKeeMWs
</commit_message>
<xml_diff>
--- a/seminar/סמינריון_רווחה_נפשית_ותק_ולגיטימיות.docx
+++ b/seminar/סמינריון_רווחה_נפשית_ותק_ולגיטימיות.docx
@@ -812,7 +812,7 @@
           <w:szCs w:val="24"/>
           <w:rtl/>
         </w:rPr>
-        <w:t xml:space="preserve">מטרת המחקר היא לבחון את הקשר בין רווחה נפשית לבין תפיסת הלגיטימיות של סגל הכליאה בקרב אסירים שפוטים, ואת הקשר בין ותק באגף ללגיטימיות. הלגיטימיות היא המשתנה התלוי. הרווחה הנפשית והוותק באגף הם המשתנים הבלתי תלויים, ולצדם משתני רקע: גיל, לאום ומספר מאסרים. העבודה פותחת בסקירת ספרות בשני חלקים, הסתגלות למאסר ורווחה נפשית מצד אחד ולגיטימיות של סגל הכליאה מצד שני, ומסתיימת בשאלות המחקר ובהשערות. לאחר מכן מוצגים פרק השיטה, פרק הממצאים והדיון, ובסופם מגבלות המחקר, סיכום, גילוי נאות ורשימת המקורות. הפלטים הסטטיסטיים והסינטקס מובאים בנספחים.</w:t>
+        <w:t xml:space="preserve">מטרת המחקר היא לבחון את הקשר בין רווחה נפשית לבין תפיסת הלגיטימיות של סגל הכליאה בקרב אסירים שפוטים, ואת הקשר בין ותק באגף ללגיטימיות. הלגיטימיות היא המשתנה התלוי. הרווחה הנפשית והוותק באגף הם המשתנים הבלתי תלויים, ולצדם משתני רקע: גיל, לאום ומספר מאסרים. העבודה פותחת בסקירת ספרות בשני חלקים, הסתגלות למאסר ורווחה נפשית מצד אחד ולגיטימיות של סגל הכליאה מצד שני, ומסתיימת בשאלות המחקר ובהשערות. לאחר מכן מוצגים פרק השיטה, פרק הממצאים והדיון, ובסופם מגבלות המחקר, סיכום, גילוי נאות ורשימת המקורות. הפלטים הסטטיסטיים מובאים בנספח.</w:t>
       </w:r>
     </w:p>
     <w:p>
@@ -3118,7 +3118,7 @@
           <w:szCs w:val="24"/>
           <w:rtl/>
         </w:rPr>
-        <w:t xml:space="preserve">, וקובץ הסינטקס המלא מובא בנספח ב'. בשלב הראשון סוננו השפוטים בלבד ונבדקה התפלגות סוג האסיר. בשלב השני חושבה סטטיסטיקה תיאורית לשמונת הפריטים ונבדקה מהימנות שני הסולמות באמצעות אלפא של קרונבך, ולאחר מכן חושבו ציוני הסולמות ונבדקו התפלגויותיהם, כולל מבחני נורמליות. בשלב השלישי חושב מתאם פירסון בין הרווחה הנפשית ללגיטימיות, ובשל ההתפלגות המוטה של הלגיטימיות חושב גם מתאם ספירמן, וכן מתאמים בין כל פריט לגיטימיות לבין הרווחה. בשלב הרביעי נערכה רגרסיה ליניארית היררכית שבה הלגיטימיות שימשה משתנה תלוי: בצעד הראשון הוזנה הרווחה הנפשית, בצעד השני הגיל והלאום, ובצעד השלישי מספר המאסרים והוותק באגף. בשלב החמישי נבחן הקשר בין ותק באגף ללגיטימיות באמצעות ניתוח שונות חד-כיווני על פני ארבע קטגוריות הוותק, מתאם ספירמן ומבחן </w:t>
+        <w:t xml:space="preserve">, בשלב הראשון סוננו השפוטים בלבד ונבדקה התפלגות סוג האסיר. בשלב השני חושבה סטטיסטיקה תיאורית לשמונת הפריטים ונבדקה מהימנות שני הסולמות באמצעות אלפא של קרונבך, ולאחר מכן חושבו ציוני הסולמות ונבדקו התפלגויותיהם, כולל מבחני נורמליות. בשלב השלישי חושב מתאם פירסון בין הרווחה הנפשית ללגיטימיות, ובשל ההתפלגות המוטה של הלגיטימיות חושב גם מתאם ספירמן, וכן מתאמים בין כל פריט לגיטימיות לבין הרווחה. בשלב הרביעי נערכה רגרסיה ליניארית היררכית שבה הלגיטימיות שימשה משתנה תלוי: בצעד הראשון הוזנה הרווחה הנפשית, בצעד השני הגיל והלאום, ובצעד השלישי מספר המאסרים והוותק באגף. בשלב החמישי נבחן הקשר בין ותק באגף ללגיטימיות באמצעות ניתוח שונות חד-כיווני על פני ארבע קטגוריות הוותק, מתאם ספירמן ומבחן </w:t>
       </w:r>
       <w:r>
         <w:rPr>
@@ -3152,7 +3152,7 @@
           <w:szCs w:val="24"/>
           <w:rtl/>
         </w:rPr>
-        <w:t xml:space="preserve">. הפלטים המרכזיים מובאים בנספח א'.</w:t>
+        <w:t xml:space="preserve">. הפלטים המרכזיים מובאים בנספח.</w:t>
       </w:r>
     </w:p>
     <w:p>
@@ -8310,7 +8310,7 @@
           <w:szCs w:val="20"/>
           <w:rtl/>
         </w:rPr>
-        <w:t xml:space="preserve">, נספח א'.</w:t>
+        <w:t xml:space="preserve">, נספח.</w:t>
       </w:r>
     </w:p>
     <w:p>
@@ -10212,7 +10212,7 @@
           <w:szCs w:val="20"/>
           <w:rtl/>
         </w:rPr>
-        <w:t xml:space="preserve">, נספח א'.</w:t>
+        <w:t xml:space="preserve">, נספח.</w:t>
       </w:r>
     </w:p>
     <w:p>
@@ -11367,7 +11367,7 @@
           <w:szCs w:val="20"/>
           <w:rtl/>
         </w:rPr>
-        <w:t xml:space="preserve">, נספח א'.</w:t>
+        <w:t xml:space="preserve">, נספח.</w:t>
       </w:r>
     </w:p>
     <w:p>
@@ -12384,7 +12384,7 @@
           <w:szCs w:val="20"/>
           <w:rtl/>
         </w:rPr>
-        <w:t xml:space="preserve">, נספח א'.</w:t>
+        <w:t xml:space="preserve">, נספח.</w:t>
       </w:r>
     </w:p>
     <w:p>
@@ -16497,7 +16497,7 @@
           <w:szCs w:val="20"/>
           <w:rtl/>
         </w:rPr>
-        <w:t xml:space="preserve">, נספח א'.</w:t>
+        <w:t xml:space="preserve">, נספח.</w:t>
       </w:r>
     </w:p>
     <w:p>
@@ -20312,7 +20312,7 @@
           <w:szCs w:val="32"/>
           <w:rtl/>
         </w:rPr>
-        <w:t xml:space="preserve">נספחים</w:t>
+        <w:t xml:space="preserve">נספח</w:t>
       </w:r>
     </w:p>
     <w:p>
@@ -20332,7 +20332,7 @@
           <w:szCs w:val="28"/>
           <w:rtl/>
         </w:rPr>
-        <w:t xml:space="preserve">נספח א': פלטי SPSS</w:t>
+        <w:t xml:space="preserve">נספח: פלטי SPSS</w:t>
       </w:r>
     </w:p>
     <w:p>
@@ -33183,1216 +33183,6 @@
         </w:tc>
       </w:tr>
     </w:tbl>
-    <w:p>
-      <w:pPr>
-        <w:pStyle w:val="Heading2"/>
-        <w:keepNext/>
-        <w:bidi/>
-        <w:spacing w:after="120" w:before="240" w:line="360"/>
-        <w:jc w:val="right"/>
-      </w:pPr>
-      <w:r>
-        <w:rPr>
-          <w:rFonts w:ascii="David" w:cs="David" w:eastAsia="David" w:hAnsi="David"/>
-          <w:b/>
-          <w:bCs/>
-          <w:sz w:val="28"/>
-          <w:szCs w:val="28"/>
-          <w:rtl/>
-        </w:rPr>
-        <w:t xml:space="preserve">נספח ב': סינטקס SPSS</w:t>
-      </w:r>
-    </w:p>
-    <w:p>
-      <w:pPr>
-        <w:spacing w:after="0" w:line="276"/>
-        <w:jc w:val="left"/>
-      </w:pPr>
-      <w:r>
-        <w:rPr>
-          <w:rFonts w:ascii="Courier New" w:cs="Courier New" w:eastAsia="Courier New" w:hAnsi="Courier New"/>
-          <w:sz w:val="18"/>
-          <w:szCs w:val="18"/>
-        </w:rPr>
-        <w:t xml:space="preserve">* ==============================================================.</w:t>
-      </w:r>
-    </w:p>
-    <w:p>
-      <w:pPr>
-        <w:spacing w:after="0" w:line="276"/>
-        <w:jc w:val="left"/>
-      </w:pPr>
-      <w:r>
-        <w:rPr>
-          <w:rFonts w:ascii="Courier New" w:cs="Courier New" w:eastAsia="Courier New" w:hAnsi="Courier New"/>
-          <w:sz w:val="18"/>
-          <w:szCs w:val="18"/>
-        </w:rPr>
-        <w:t xml:space="preserve">* סמינריון: רווחה נפשית, ותק באגף ולגיטימיות הסגל בקרב שפוטים.</w:t>
-      </w:r>
-    </w:p>
-    <w:p>
-      <w:pPr>
-        <w:spacing w:after="0" w:line="276"/>
-        <w:jc w:val="left"/>
-      </w:pPr>
-      <w:r>
-        <w:rPr>
-          <w:rFonts w:ascii="Courier New" w:cs="Courier New" w:eastAsia="Courier New" w:hAnsi="Courier New"/>
-          <w:sz w:val="18"/>
-          <w:szCs w:val="18"/>
-        </w:rPr>
-        <w:t xml:space="preserve">* קובץ: synthetic_seker_d.sav (מומר מ-xlsx).</w:t>
-      </w:r>
-    </w:p>
-    <w:p>
-      <w:pPr>
-        <w:spacing w:after="0" w:line="276"/>
-        <w:jc w:val="left"/>
-      </w:pPr>
-      <w:r>
-        <w:rPr>
-          <w:rFonts w:ascii="Courier New" w:cs="Courier New" w:eastAsia="Courier New" w:hAnsi="Courier New"/>
-          <w:sz w:val="18"/>
-          <w:szCs w:val="18"/>
-        </w:rPr>
-        <w:t xml:space="preserve">* ==============================================================.</w:t>
-      </w:r>
-    </w:p>
-    <w:p>
-      <w:pPr>
-        <w:spacing w:after="0" w:line="276"/>
-        <w:jc w:val="left"/>
-      </w:pPr>
-      <w:r>
-        <w:rPr>
-          <w:rFonts w:ascii="Courier New" w:cs="Courier New" w:eastAsia="Courier New" w:hAnsi="Courier New"/>
-          <w:sz w:val="18"/>
-          <w:szCs w:val="18"/>
-        </w:rPr>
-        <w:t xml:space="preserve"/>
-      </w:r>
-    </w:p>
-    <w:p>
-      <w:pPr>
-        <w:spacing w:after="0" w:line="276"/>
-        <w:jc w:val="left"/>
-      </w:pPr>
-      <w:r>
-        <w:rPr>
-          <w:rFonts w:ascii="Courier New" w:cs="Courier New" w:eastAsia="Courier New" w:hAnsi="Courier New"/>
-          <w:sz w:val="18"/>
-          <w:szCs w:val="18"/>
-        </w:rPr>
-        <w:t xml:space="preserve">* 1. סוג האסיר בקובץ המלא.</w:t>
-      </w:r>
-    </w:p>
-    <w:p>
-      <w:pPr>
-        <w:spacing w:after="0" w:line="276"/>
-        <w:jc w:val="left"/>
-      </w:pPr>
-      <w:r>
-        <w:rPr>
-          <w:rFonts w:ascii="Courier New" w:cs="Courier New" w:eastAsia="Courier New" w:hAnsi="Courier New"/>
-          <w:sz w:val="18"/>
-          <w:szCs w:val="18"/>
-        </w:rPr>
-        <w:t xml:space="preserve">CROSSTABS TABLES=inmate_type BY shafut /CELLS=COUNT.</w:t>
-      </w:r>
-    </w:p>
-    <w:p>
-      <w:pPr>
-        <w:spacing w:after="0" w:line="276"/>
-        <w:jc w:val="left"/>
-      </w:pPr>
-      <w:r>
-        <w:rPr>
-          <w:rFonts w:ascii="Courier New" w:cs="Courier New" w:eastAsia="Courier New" w:hAnsi="Courier New"/>
-          <w:sz w:val="18"/>
-          <w:szCs w:val="18"/>
-        </w:rPr>
-        <w:t xml:space="preserve"/>
-      </w:r>
-    </w:p>
-    <w:p>
-      <w:pPr>
-        <w:spacing w:after="0" w:line="276"/>
-        <w:jc w:val="left"/>
-      </w:pPr>
-      <w:r>
-        <w:rPr>
-          <w:rFonts w:ascii="Courier New" w:cs="Courier New" w:eastAsia="Courier New" w:hAnsi="Courier New"/>
-          <w:sz w:val="18"/>
-          <w:szCs w:val="18"/>
-        </w:rPr>
-        <w:t xml:space="preserve">* 2. סינון שפוטים בלבד.</w:t>
-      </w:r>
-    </w:p>
-    <w:p>
-      <w:pPr>
-        <w:spacing w:after="0" w:line="276"/>
-        <w:jc w:val="left"/>
-      </w:pPr>
-      <w:r>
-        <w:rPr>
-          <w:rFonts w:ascii="Courier New" w:cs="Courier New" w:eastAsia="Courier New" w:hAnsi="Courier New"/>
-          <w:sz w:val="18"/>
-          <w:szCs w:val="18"/>
-        </w:rPr>
-        <w:t xml:space="preserve">COMPUTE filt_shafut = (inmate_type = 'פליליים').</w:t>
-      </w:r>
-    </w:p>
-    <w:p>
-      <w:pPr>
-        <w:spacing w:after="0" w:line="276"/>
-        <w:jc w:val="left"/>
-      </w:pPr>
-      <w:r>
-        <w:rPr>
-          <w:rFonts w:ascii="Courier New" w:cs="Courier New" w:eastAsia="Courier New" w:hAnsi="Courier New"/>
-          <w:sz w:val="18"/>
-          <w:szCs w:val="18"/>
-        </w:rPr>
-        <w:t xml:space="preserve">FILTER BY filt_shafut.</w:t>
-      </w:r>
-    </w:p>
-    <w:p>
-      <w:pPr>
-        <w:spacing w:after="0" w:line="276"/>
-        <w:jc w:val="left"/>
-      </w:pPr>
-      <w:r>
-        <w:rPr>
-          <w:rFonts w:ascii="Courier New" w:cs="Courier New" w:eastAsia="Courier New" w:hAnsi="Courier New"/>
-          <w:sz w:val="18"/>
-          <w:szCs w:val="18"/>
-        </w:rPr>
-        <w:t xml:space="preserve"/>
-      </w:r>
-    </w:p>
-    <w:p>
-      <w:pPr>
-        <w:spacing w:after="0" w:line="276"/>
-        <w:jc w:val="left"/>
-      </w:pPr>
-      <w:r>
-        <w:rPr>
-          <w:rFonts w:ascii="Courier New" w:cs="Courier New" w:eastAsia="Courier New" w:hAnsi="Courier New"/>
-          <w:sz w:val="18"/>
-          <w:szCs w:val="18"/>
-        </w:rPr>
-        <w:t xml:space="preserve">* 3. סטטיסטיקה תיאורית לפריטים.</w:t>
-      </w:r>
-    </w:p>
-    <w:p>
-      <w:pPr>
-        <w:spacing w:after="0" w:line="276"/>
-        <w:jc w:val="left"/>
-      </w:pPr>
-      <w:r>
-        <w:rPr>
-          <w:rFonts w:ascii="Courier New" w:cs="Courier New" w:eastAsia="Courier New" w:hAnsi="Courier New"/>
-          <w:sz w:val="18"/>
-          <w:szCs w:val="18"/>
-        </w:rPr>
-        <w:t xml:space="preserve">FREQUENCIES VARIABLES=SR_yakhol_ledaber_im_soharim SR_soherim_mekhabedim_oti</w:t>
-      </w:r>
-    </w:p>
-    <w:p>
-      <w:pPr>
-        <w:spacing w:after="0" w:line="276"/>
-        <w:jc w:val="left"/>
-      </w:pPr>
-      <w:r>
-        <w:rPr>
-          <w:rFonts w:ascii="Courier New" w:cs="Courier New" w:eastAsia="Courier New" w:hAnsi="Courier New"/>
-          <w:sz w:val="18"/>
-          <w:szCs w:val="18"/>
-        </w:rPr>
-        <w:t xml:space="preserve">    SR_bakashot_metupalot SR_briut_hishtapra SR_briut_gufanit SR_briut_nafshit</w:t>
-      </w:r>
-    </w:p>
-    <w:p>
-      <w:pPr>
-        <w:spacing w:after="0" w:line="276"/>
-        <w:jc w:val="left"/>
-      </w:pPr>
-      <w:r>
-        <w:rPr>
-          <w:rFonts w:ascii="Courier New" w:cs="Courier New" w:eastAsia="Courier New" w:hAnsi="Courier New"/>
-          <w:sz w:val="18"/>
-          <w:szCs w:val="18"/>
-        </w:rPr>
-        <w:t xml:space="preserve">    SR_hargasha_sameah SR_meruze_meha_haim</w:t>
-      </w:r>
-    </w:p>
-    <w:p>
-      <w:pPr>
-        <w:spacing w:after="0" w:line="276"/>
-        <w:jc w:val="left"/>
-      </w:pPr>
-      <w:r>
-        <w:rPr>
-          <w:rFonts w:ascii="Courier New" w:cs="Courier New" w:eastAsia="Courier New" w:hAnsi="Courier New"/>
-          <w:sz w:val="18"/>
-          <w:szCs w:val="18"/>
-        </w:rPr>
-        <w:t xml:space="preserve">  /STATISTICS=MEAN MEDIAN STDDEV MINIMUM MAXIMUM SKEWNESS KURTOSIS</w:t>
-      </w:r>
-    </w:p>
-    <w:p>
-      <w:pPr>
-        <w:spacing w:after="0" w:line="276"/>
-        <w:jc w:val="left"/>
-      </w:pPr>
-      <w:r>
-        <w:rPr>
-          <w:rFonts w:ascii="Courier New" w:cs="Courier New" w:eastAsia="Courier New" w:hAnsi="Courier New"/>
-          <w:sz w:val="18"/>
-          <w:szCs w:val="18"/>
-        </w:rPr>
-        <w:t xml:space="preserve">  /FORMAT=NOTABLE /BARCHART.</w:t>
-      </w:r>
-    </w:p>
-    <w:p>
-      <w:pPr>
-        <w:spacing w:after="0" w:line="276"/>
-        <w:jc w:val="left"/>
-      </w:pPr>
-      <w:r>
-        <w:rPr>
-          <w:rFonts w:ascii="Courier New" w:cs="Courier New" w:eastAsia="Courier New" w:hAnsi="Courier New"/>
-          <w:sz w:val="18"/>
-          <w:szCs w:val="18"/>
-        </w:rPr>
-        <w:t xml:space="preserve"/>
-      </w:r>
-    </w:p>
-    <w:p>
-      <w:pPr>
-        <w:spacing w:after="0" w:line="276"/>
-        <w:jc w:val="left"/>
-      </w:pPr>
-      <w:r>
-        <w:rPr>
-          <w:rFonts w:ascii="Courier New" w:cs="Courier New" w:eastAsia="Courier New" w:hAnsi="Courier New"/>
-          <w:sz w:val="18"/>
-          <w:szCs w:val="18"/>
-        </w:rPr>
-        <w:t xml:space="preserve">* 4. מהימנות הסולמות.</w:t>
-      </w:r>
-    </w:p>
-    <w:p>
-      <w:pPr>
-        <w:spacing w:after="0" w:line="276"/>
-        <w:jc w:val="left"/>
-      </w:pPr>
-      <w:r>
-        <w:rPr>
-          <w:rFonts w:ascii="Courier New" w:cs="Courier New" w:eastAsia="Courier New" w:hAnsi="Courier New"/>
-          <w:sz w:val="18"/>
-          <w:szCs w:val="18"/>
-        </w:rPr>
-        <w:t xml:space="preserve">RELIABILITY</w:t>
-      </w:r>
-    </w:p>
-    <w:p>
-      <w:pPr>
-        <w:spacing w:after="0" w:line="276"/>
-        <w:jc w:val="left"/>
-      </w:pPr>
-      <w:r>
-        <w:rPr>
-          <w:rFonts w:ascii="Courier New" w:cs="Courier New" w:eastAsia="Courier New" w:hAnsi="Courier New"/>
-          <w:sz w:val="18"/>
-          <w:szCs w:val="18"/>
-        </w:rPr>
-        <w:t xml:space="preserve">  /VARIABLES=SR_yakhol_ledaber_im_soharim SR_soherim_mekhabedim_oti SR_bakashot_metupalot</w:t>
-      </w:r>
-    </w:p>
-    <w:p>
-      <w:pPr>
-        <w:spacing w:after="0" w:line="276"/>
-        <w:jc w:val="left"/>
-      </w:pPr>
-      <w:r>
-        <w:rPr>
-          <w:rFonts w:ascii="Courier New" w:cs="Courier New" w:eastAsia="Courier New" w:hAnsi="Courier New"/>
-          <w:sz w:val="18"/>
-          <w:szCs w:val="18"/>
-        </w:rPr>
-        <w:t xml:space="preserve">  /SCALE('לגיטימיות הסגל') ALL /MODEL=ALPHA</w:t>
-      </w:r>
-    </w:p>
-    <w:p>
-      <w:pPr>
-        <w:spacing w:after="0" w:line="276"/>
-        <w:jc w:val="left"/>
-      </w:pPr>
-      <w:r>
-        <w:rPr>
-          <w:rFonts w:ascii="Courier New" w:cs="Courier New" w:eastAsia="Courier New" w:hAnsi="Courier New"/>
-          <w:sz w:val="18"/>
-          <w:szCs w:val="18"/>
-        </w:rPr>
-        <w:t xml:space="preserve">  /STATISTICS=DESCRIPTIVE CORR SCALE /SUMMARY=TOTAL.</w:t>
-      </w:r>
-    </w:p>
-    <w:p>
-      <w:pPr>
-        <w:spacing w:after="0" w:line="276"/>
-        <w:jc w:val="left"/>
-      </w:pPr>
-      <w:r>
-        <w:rPr>
-          <w:rFonts w:ascii="Courier New" w:cs="Courier New" w:eastAsia="Courier New" w:hAnsi="Courier New"/>
-          <w:sz w:val="18"/>
-          <w:szCs w:val="18"/>
-        </w:rPr>
-        <w:t xml:space="preserve">RELIABILITY</w:t>
-      </w:r>
-    </w:p>
-    <w:p>
-      <w:pPr>
-        <w:spacing w:after="0" w:line="276"/>
-        <w:jc w:val="left"/>
-      </w:pPr>
-      <w:r>
-        <w:rPr>
-          <w:rFonts w:ascii="Courier New" w:cs="Courier New" w:eastAsia="Courier New" w:hAnsi="Courier New"/>
-          <w:sz w:val="18"/>
-          <w:szCs w:val="18"/>
-        </w:rPr>
-        <w:t xml:space="preserve">  /VARIABLES=SR_briut_hishtapra SR_briut_gufanit SR_briut_nafshit SR_hargasha_sameah SR_meruze_meha_haim</w:t>
-      </w:r>
-    </w:p>
-    <w:p>
-      <w:pPr>
-        <w:spacing w:after="0" w:line="276"/>
-        <w:jc w:val="left"/>
-      </w:pPr>
-      <w:r>
-        <w:rPr>
-          <w:rFonts w:ascii="Courier New" w:cs="Courier New" w:eastAsia="Courier New" w:hAnsi="Courier New"/>
-          <w:sz w:val="18"/>
-          <w:szCs w:val="18"/>
-        </w:rPr>
-        <w:t xml:space="preserve">  /SCALE('רווחה נפשית') ALL /MODEL=ALPHA</w:t>
-      </w:r>
-    </w:p>
-    <w:p>
-      <w:pPr>
-        <w:spacing w:after="0" w:line="276"/>
-        <w:jc w:val="left"/>
-      </w:pPr>
-      <w:r>
-        <w:rPr>
-          <w:rFonts w:ascii="Courier New" w:cs="Courier New" w:eastAsia="Courier New" w:hAnsi="Courier New"/>
-          <w:sz w:val="18"/>
-          <w:szCs w:val="18"/>
-        </w:rPr>
-        <w:t xml:space="preserve">  /STATISTICS=DESCRIPTIVE CORR SCALE /SUMMARY=TOTAL.</w:t>
-      </w:r>
-    </w:p>
-    <w:p>
-      <w:pPr>
-        <w:spacing w:after="0" w:line="276"/>
-        <w:jc w:val="left"/>
-      </w:pPr>
-      <w:r>
-        <w:rPr>
-          <w:rFonts w:ascii="Courier New" w:cs="Courier New" w:eastAsia="Courier New" w:hAnsi="Courier New"/>
-          <w:sz w:val="18"/>
-          <w:szCs w:val="18"/>
-        </w:rPr>
-        <w:t xml:space="preserve"/>
-      </w:r>
-    </w:p>
-    <w:p>
-      <w:pPr>
-        <w:spacing w:after="0" w:line="276"/>
-        <w:jc w:val="left"/>
-      </w:pPr>
-      <w:r>
-        <w:rPr>
-          <w:rFonts w:ascii="Courier New" w:cs="Courier New" w:eastAsia="Courier New" w:hAnsi="Courier New"/>
-          <w:sz w:val="18"/>
-          <w:szCs w:val="18"/>
-        </w:rPr>
-        <w:t xml:space="preserve">* 5. חישוב ציוני הסולמות (ממוצע, לפחות מחצית הפריטים).</w:t>
-      </w:r>
-    </w:p>
-    <w:p>
-      <w:pPr>
-        <w:spacing w:after="0" w:line="276"/>
-        <w:jc w:val="left"/>
-      </w:pPr>
-      <w:r>
-        <w:rPr>
-          <w:rFonts w:ascii="Courier New" w:cs="Courier New" w:eastAsia="Courier New" w:hAnsi="Courier New"/>
-          <w:sz w:val="18"/>
-          <w:szCs w:val="18"/>
-        </w:rPr>
-        <w:t xml:space="preserve">COMPUTE legitimacy = MEAN.2(SR_yakhol_ledaber_im_soharim, SR_soherim_mekhabedim_oti, SR_bakashot_metupalot).</w:t>
-      </w:r>
-    </w:p>
-    <w:p>
-      <w:pPr>
-        <w:spacing w:after="0" w:line="276"/>
-        <w:jc w:val="left"/>
-      </w:pPr>
-      <w:r>
-        <w:rPr>
-          <w:rFonts w:ascii="Courier New" w:cs="Courier New" w:eastAsia="Courier New" w:hAnsi="Courier New"/>
-          <w:sz w:val="18"/>
-          <w:szCs w:val="18"/>
-        </w:rPr>
-        <w:t xml:space="preserve">COMPUTE wellbeing  = MEAN.3(SR_briut_hishtapra, SR_briut_gufanit, SR_briut_nafshit, SR_hargasha_sameah, SR_meruze_meha_haim).</w:t>
-      </w:r>
-    </w:p>
-    <w:p>
-      <w:pPr>
-        <w:spacing w:after="0" w:line="276"/>
-        <w:jc w:val="left"/>
-      </w:pPr>
-      <w:r>
-        <w:rPr>
-          <w:rFonts w:ascii="Courier New" w:cs="Courier New" w:eastAsia="Courier New" w:hAnsi="Courier New"/>
-          <w:sz w:val="18"/>
-          <w:szCs w:val="18"/>
-        </w:rPr>
-        <w:t xml:space="preserve">VARIABLE LABELS legitimacy 'לגיטימיות הסגל (ממוצע 3 פריטים, 1-5)'</w:t>
-      </w:r>
-    </w:p>
-    <w:p>
-      <w:pPr>
-        <w:spacing w:after="0" w:line="276"/>
-        <w:jc w:val="left"/>
-      </w:pPr>
-      <w:r>
-        <w:rPr>
-          <w:rFonts w:ascii="Courier New" w:cs="Courier New" w:eastAsia="Courier New" w:hAnsi="Courier New"/>
-          <w:sz w:val="18"/>
-          <w:szCs w:val="18"/>
-        </w:rPr>
-        <w:t xml:space="preserve">                wellbeing  'רווחה נפשית (ממוצע 5 פריטים, 1-5)'.</w:t>
-      </w:r>
-    </w:p>
-    <w:p>
-      <w:pPr>
-        <w:spacing w:after="0" w:line="276"/>
-        <w:jc w:val="left"/>
-      </w:pPr>
-      <w:r>
-        <w:rPr>
-          <w:rFonts w:ascii="Courier New" w:cs="Courier New" w:eastAsia="Courier New" w:hAnsi="Courier New"/>
-          <w:sz w:val="18"/>
-          <w:szCs w:val="18"/>
-        </w:rPr>
-        <w:t xml:space="preserve">DESCRIPTIVES VARIABLES=legitimacy wellbeing</w:t>
-      </w:r>
-    </w:p>
-    <w:p>
-      <w:pPr>
-        <w:spacing w:after="0" w:line="276"/>
-        <w:jc w:val="left"/>
-      </w:pPr>
-      <w:r>
-        <w:rPr>
-          <w:rFonts w:ascii="Courier New" w:cs="Courier New" w:eastAsia="Courier New" w:hAnsi="Courier New"/>
-          <w:sz w:val="18"/>
-          <w:szCs w:val="18"/>
-        </w:rPr>
-        <w:t xml:space="preserve">  /STATISTICS=MEAN STDDEV MIN MAX SKEWNESS KURTOSIS.</w:t>
-      </w:r>
-    </w:p>
-    <w:p>
-      <w:pPr>
-        <w:spacing w:after="0" w:line="276"/>
-        <w:jc w:val="left"/>
-      </w:pPr>
-      <w:r>
-        <w:rPr>
-          <w:rFonts w:ascii="Courier New" w:cs="Courier New" w:eastAsia="Courier New" w:hAnsi="Courier New"/>
-          <w:sz w:val="18"/>
-          <w:szCs w:val="18"/>
-        </w:rPr>
-        <w:t xml:space="preserve">EXAMINE VARIABLES=legitimacy wellbeing</w:t>
-      </w:r>
-    </w:p>
-    <w:p>
-      <w:pPr>
-        <w:spacing w:after="0" w:line="276"/>
-        <w:jc w:val="left"/>
-      </w:pPr>
-      <w:r>
-        <w:rPr>
-          <w:rFonts w:ascii="Courier New" w:cs="Courier New" w:eastAsia="Courier New" w:hAnsi="Courier New"/>
-          <w:sz w:val="18"/>
-          <w:szCs w:val="18"/>
-        </w:rPr>
-        <w:t xml:space="preserve">  /PLOT HISTOGRAM NPPLOT /STATISTICS DESCRIPTIVES /MISSING PAIRWISE.</w:t>
-      </w:r>
-    </w:p>
-    <w:p>
-      <w:pPr>
-        <w:spacing w:after="0" w:line="276"/>
-        <w:jc w:val="left"/>
-      </w:pPr>
-      <w:r>
-        <w:rPr>
-          <w:rFonts w:ascii="Courier New" w:cs="Courier New" w:eastAsia="Courier New" w:hAnsi="Courier New"/>
-          <w:sz w:val="18"/>
-          <w:szCs w:val="18"/>
-        </w:rPr>
-        <w:t xml:space="preserve"/>
-      </w:r>
-    </w:p>
-    <w:p>
-      <w:pPr>
-        <w:spacing w:after="0" w:line="276"/>
-        <w:jc w:val="left"/>
-      </w:pPr>
-      <w:r>
-        <w:rPr>
-          <w:rFonts w:ascii="Courier New" w:cs="Courier New" w:eastAsia="Courier New" w:hAnsi="Courier New"/>
-          <w:sz w:val="18"/>
-          <w:szCs w:val="18"/>
-        </w:rPr>
-        <w:t xml:space="preserve">* 6. מתאמים.</w:t>
-      </w:r>
-    </w:p>
-    <w:p>
-      <w:pPr>
-        <w:spacing w:after="0" w:line="276"/>
-        <w:jc w:val="left"/>
-      </w:pPr>
-      <w:r>
-        <w:rPr>
-          <w:rFonts w:ascii="Courier New" w:cs="Courier New" w:eastAsia="Courier New" w:hAnsi="Courier New"/>
-          <w:sz w:val="18"/>
-          <w:szCs w:val="18"/>
-        </w:rPr>
-        <w:t xml:space="preserve">CORRELATIONS /VARIABLES=legitimacy wellbeing</w:t>
-      </w:r>
-    </w:p>
-    <w:p>
-      <w:pPr>
-        <w:spacing w:after="0" w:line="276"/>
-        <w:jc w:val="left"/>
-      </w:pPr>
-      <w:r>
-        <w:rPr>
-          <w:rFonts w:ascii="Courier New" w:cs="Courier New" w:eastAsia="Courier New" w:hAnsi="Courier New"/>
-          <w:sz w:val="18"/>
-          <w:szCs w:val="18"/>
-        </w:rPr>
-        <w:t xml:space="preserve">  /PRINT=TWOTAIL NOSIG /STATISTICS DESCRIPTIVES /MISSING=PAIRWISE.</w:t>
-      </w:r>
-    </w:p>
-    <w:p>
-      <w:pPr>
-        <w:spacing w:after="0" w:line="276"/>
-        <w:jc w:val="left"/>
-      </w:pPr>
-      <w:r>
-        <w:rPr>
-          <w:rFonts w:ascii="Courier New" w:cs="Courier New" w:eastAsia="Courier New" w:hAnsi="Courier New"/>
-          <w:sz w:val="18"/>
-          <w:szCs w:val="18"/>
-        </w:rPr>
-        <w:t xml:space="preserve">NONPAR CORR /VARIABLES=legitimacy wellbeing /PRINT=SPEARMAN TWOTAIL NOSIG /MISSING=PAIRWISE.</w:t>
-      </w:r>
-    </w:p>
-    <w:p>
-      <w:pPr>
-        <w:spacing w:after="0" w:line="276"/>
-        <w:jc w:val="left"/>
-      </w:pPr>
-      <w:r>
-        <w:rPr>
-          <w:rFonts w:ascii="Courier New" w:cs="Courier New" w:eastAsia="Courier New" w:hAnsi="Courier New"/>
-          <w:sz w:val="18"/>
-          <w:szCs w:val="18"/>
-        </w:rPr>
-        <w:t xml:space="preserve">NONPAR CORR /VARIABLES=SR_yakhol_ledaber_im_soharim SR_soherim_mekhabedim_oti SR_bakashot_metupalot</w:t>
-      </w:r>
-    </w:p>
-    <w:p>
-      <w:pPr>
-        <w:spacing w:after="0" w:line="276"/>
-        <w:jc w:val="left"/>
-      </w:pPr>
-      <w:r>
-        <w:rPr>
-          <w:rFonts w:ascii="Courier New" w:cs="Courier New" w:eastAsia="Courier New" w:hAnsi="Courier New"/>
-          <w:sz w:val="18"/>
-          <w:szCs w:val="18"/>
-        </w:rPr>
-        <w:t xml:space="preserve">  WITH wellbeing /PRINT=SPEARMAN TWOTAIL NOSIG /MISSING=PAIRWISE.</w:t>
-      </w:r>
-    </w:p>
-    <w:p>
-      <w:pPr>
-        <w:spacing w:after="0" w:line="276"/>
-        <w:jc w:val="left"/>
-      </w:pPr>
-      <w:r>
-        <w:rPr>
-          <w:rFonts w:ascii="Courier New" w:cs="Courier New" w:eastAsia="Courier New" w:hAnsi="Courier New"/>
-          <w:sz w:val="18"/>
-          <w:szCs w:val="18"/>
-        </w:rPr>
-        <w:t xml:space="preserve"/>
-      </w:r>
-    </w:p>
-    <w:p>
-      <w:pPr>
-        <w:spacing w:after="0" w:line="276"/>
-        <w:jc w:val="left"/>
-      </w:pPr>
-      <w:r>
-        <w:rPr>
-          <w:rFonts w:ascii="Courier New" w:cs="Courier New" w:eastAsia="Courier New" w:hAnsi="Courier New"/>
-          <w:sz w:val="18"/>
-          <w:szCs w:val="18"/>
-        </w:rPr>
-        <w:t xml:space="preserve">* 7. רווחה לפי שלוש רמות לגיטימיות.</w:t>
-      </w:r>
-    </w:p>
-    <w:p>
-      <w:pPr>
-        <w:spacing w:after="0" w:line="276"/>
-        <w:jc w:val="left"/>
-      </w:pPr>
-      <w:r>
-        <w:rPr>
-          <w:rFonts w:ascii="Courier New" w:cs="Courier New" w:eastAsia="Courier New" w:hAnsi="Courier New"/>
-          <w:sz w:val="18"/>
-          <w:szCs w:val="18"/>
-        </w:rPr>
-        <w:t xml:space="preserve">RECODE legitimacy (LOWEST THRU 3.5=1) (3.5 THRU 4.5=2) (4.5 THRU HIGHEST=3) INTO leg_grp3.</w:t>
-      </w:r>
-    </w:p>
-    <w:p>
-      <w:pPr>
-        <w:spacing w:after="0" w:line="276"/>
-        <w:jc w:val="left"/>
-      </w:pPr>
-      <w:r>
-        <w:rPr>
-          <w:rFonts w:ascii="Courier New" w:cs="Courier New" w:eastAsia="Courier New" w:hAnsi="Courier New"/>
-          <w:sz w:val="18"/>
-          <w:szCs w:val="18"/>
-        </w:rPr>
-        <w:t xml:space="preserve">VALUE LABELS leg_grp3 1 'נמוכה' 2 'בינונית' 3 'גבוהה'.</w:t>
-      </w:r>
-    </w:p>
-    <w:p>
-      <w:pPr>
-        <w:spacing w:after="0" w:line="276"/>
-        <w:jc w:val="left"/>
-      </w:pPr>
-      <w:r>
-        <w:rPr>
-          <w:rFonts w:ascii="Courier New" w:cs="Courier New" w:eastAsia="Courier New" w:hAnsi="Courier New"/>
-          <w:sz w:val="18"/>
-          <w:szCs w:val="18"/>
-        </w:rPr>
-        <w:t xml:space="preserve">MEANS TABLES=wellbeing BY leg_grp3 /CELLS=MEAN COUNT STDDEV /STATISTICS=ANOVA LINEARITY.</w:t>
-      </w:r>
-    </w:p>
-    <w:p>
-      <w:pPr>
-        <w:spacing w:after="0" w:line="276"/>
-        <w:jc w:val="left"/>
-      </w:pPr>
-      <w:r>
-        <w:rPr>
-          <w:rFonts w:ascii="Courier New" w:cs="Courier New" w:eastAsia="Courier New" w:hAnsi="Courier New"/>
-          <w:sz w:val="18"/>
-          <w:szCs w:val="18"/>
-        </w:rPr>
-        <w:t xml:space="preserve">ONEWAY wellbeing BY leg_grp3 /STATISTICS DESCRIPTIVES HOMOGENEITY WELCH</w:t>
-      </w:r>
-    </w:p>
-    <w:p>
-      <w:pPr>
-        <w:spacing w:after="0" w:line="276"/>
-        <w:jc w:val="left"/>
-      </w:pPr>
-      <w:r>
-        <w:rPr>
-          <w:rFonts w:ascii="Courier New" w:cs="Courier New" w:eastAsia="Courier New" w:hAnsi="Courier New"/>
-          <w:sz w:val="18"/>
-          <w:szCs w:val="18"/>
-        </w:rPr>
-        <w:t xml:space="preserve">  /POSTHOC=GAMES BONFERRONI ALPHA(0.05) /MISSING ANALYSIS.</w:t>
-      </w:r>
-    </w:p>
-    <w:p>
-      <w:pPr>
-        <w:spacing w:after="0" w:line="276"/>
-        <w:jc w:val="left"/>
-      </w:pPr>
-      <w:r>
-        <w:rPr>
-          <w:rFonts w:ascii="Courier New" w:cs="Courier New" w:eastAsia="Courier New" w:hAnsi="Courier New"/>
-          <w:sz w:val="18"/>
-          <w:szCs w:val="18"/>
-        </w:rPr>
-        <w:t xml:space="preserve"/>
-      </w:r>
-    </w:p>
-    <w:p>
-      <w:pPr>
-        <w:spacing w:after="0" w:line="276"/>
-        <w:jc w:val="left"/>
-      </w:pPr>
-      <w:r>
-        <w:rPr>
-          <w:rFonts w:ascii="Courier New" w:cs="Courier New" w:eastAsia="Courier New" w:hAnsi="Courier New"/>
-          <w:sz w:val="18"/>
-          <w:szCs w:val="18"/>
-        </w:rPr>
-        <w:t xml:space="preserve">* 8. משתני רקע מקודדים.</w:t>
-      </w:r>
-    </w:p>
-    <w:p>
-      <w:pPr>
-        <w:spacing w:after="0" w:line="276"/>
-        <w:jc w:val="left"/>
-      </w:pPr>
-      <w:r>
-        <w:rPr>
-          <w:rFonts w:ascii="Courier New" w:cs="Courier New" w:eastAsia="Courier New" w:hAnsi="Courier New"/>
-          <w:sz w:val="18"/>
-          <w:szCs w:val="18"/>
-        </w:rPr>
-        <w:t xml:space="preserve">COMPUTE yehudi = (leom_rec = 'יהודים').</w:t>
-      </w:r>
-    </w:p>
-    <w:p>
-      <w:pPr>
-        <w:spacing w:after="0" w:line="276"/>
-        <w:jc w:val="left"/>
-      </w:pPr>
-      <w:r>
-        <w:rPr>
-          <w:rFonts w:ascii="Courier New" w:cs="Courier New" w:eastAsia="Courier New" w:hAnsi="Courier New"/>
-          <w:sz w:val="18"/>
-          <w:szCs w:val="18"/>
-        </w:rPr>
-        <w:t xml:space="preserve">RECODE knissot_shafut ('רק פעם אחת'=1) ('שני מאסרים'=2) ('שלושה מאסרים ויותר'=3) INTO knissot_n.</w:t>
-      </w:r>
-    </w:p>
-    <w:p>
-      <w:pPr>
-        <w:spacing w:after="0" w:line="276"/>
-        <w:jc w:val="left"/>
-      </w:pPr>
-      <w:r>
-        <w:rPr>
-          <w:rFonts w:ascii="Courier New" w:cs="Courier New" w:eastAsia="Courier New" w:hAnsi="Courier New"/>
-          <w:sz w:val="18"/>
-          <w:szCs w:val="18"/>
-        </w:rPr>
-        <w:t xml:space="preserve">RECODE zman_ba_agaf ('פחות משבוע'=1) ('שבוע עד חודש'=2) ('חודש עד שלושה חודשים'=3)</w:t>
-      </w:r>
-    </w:p>
-    <w:p>
-      <w:pPr>
-        <w:spacing w:after="0" w:line="276"/>
-        <w:jc w:val="left"/>
-      </w:pPr>
-      <w:r>
-        <w:rPr>
-          <w:rFonts w:ascii="Courier New" w:cs="Courier New" w:eastAsia="Courier New" w:hAnsi="Courier New"/>
-          <w:sz w:val="18"/>
-          <w:szCs w:val="18"/>
-        </w:rPr>
-        <w:t xml:space="preserve">       ('מעל שלושה חודשים'=4) INTO vetek4.</w:t>
-      </w:r>
-    </w:p>
-    <w:p>
-      <w:pPr>
-        <w:spacing w:after="0" w:line="276"/>
-        <w:jc w:val="left"/>
-      </w:pPr>
-      <w:r>
-        <w:rPr>
-          <w:rFonts w:ascii="Courier New" w:cs="Courier New" w:eastAsia="Courier New" w:hAnsi="Courier New"/>
-          <w:sz w:val="18"/>
-          <w:szCs w:val="18"/>
-        </w:rPr>
-        <w:t xml:space="preserve">COMPUTE vetek_bin = (time_in_agaf = 2).</w:t>
-      </w:r>
-    </w:p>
-    <w:p>
-      <w:pPr>
-        <w:spacing w:after="0" w:line="276"/>
-        <w:jc w:val="left"/>
-      </w:pPr>
-      <w:r>
-        <w:rPr>
-          <w:rFonts w:ascii="Courier New" w:cs="Courier New" w:eastAsia="Courier New" w:hAnsi="Courier New"/>
-          <w:sz w:val="18"/>
-          <w:szCs w:val="18"/>
-        </w:rPr>
-        <w:t xml:space="preserve">VALUE LABELS vetek4 1 'פחות משבוע' 2 'שבוע עד חודש' 3 'חודש עד שלושה חודשים' 4 'מעל שלושה חודשים'</w:t>
-      </w:r>
-    </w:p>
-    <w:p>
-      <w:pPr>
-        <w:spacing w:after="0" w:line="276"/>
-        <w:jc w:val="left"/>
-      </w:pPr>
-      <w:r>
-        <w:rPr>
-          <w:rFonts w:ascii="Courier New" w:cs="Courier New" w:eastAsia="Courier New" w:hAnsi="Courier New"/>
-          <w:sz w:val="18"/>
-          <w:szCs w:val="18"/>
-        </w:rPr>
-        <w:t xml:space="preserve">  /vetek_bin 0 'עד חודש' 1 'מעל חודש' /yehudi 0 'לא יהודי' 1 'יהודי'.</w:t>
-      </w:r>
-    </w:p>
-    <w:p>
-      <w:pPr>
-        <w:spacing w:after="0" w:line="276"/>
-        <w:jc w:val="left"/>
-      </w:pPr>
-      <w:r>
-        <w:rPr>
-          <w:rFonts w:ascii="Courier New" w:cs="Courier New" w:eastAsia="Courier New" w:hAnsi="Courier New"/>
-          <w:sz w:val="18"/>
-          <w:szCs w:val="18"/>
-        </w:rPr>
-        <w:t xml:space="preserve"/>
-      </w:r>
-    </w:p>
-    <w:p>
-      <w:pPr>
-        <w:spacing w:after="0" w:line="276"/>
-        <w:jc w:val="left"/>
-      </w:pPr>
-      <w:r>
-        <w:rPr>
-          <w:rFonts w:ascii="Courier New" w:cs="Courier New" w:eastAsia="Courier New" w:hAnsi="Courier New"/>
-          <w:sz w:val="18"/>
-          <w:szCs w:val="18"/>
-        </w:rPr>
-        <w:t xml:space="preserve">* 9. רגרסיה היררכית: משתנה תלוי לגיטימיות.</w:t>
-      </w:r>
-    </w:p>
-    <w:p>
-      <w:pPr>
-        <w:spacing w:after="0" w:line="276"/>
-        <w:jc w:val="left"/>
-      </w:pPr>
-      <w:r>
-        <w:rPr>
-          <w:rFonts w:ascii="Courier New" w:cs="Courier New" w:eastAsia="Courier New" w:hAnsi="Courier New"/>
-          <w:sz w:val="18"/>
-          <w:szCs w:val="18"/>
-        </w:rPr>
-        <w:t xml:space="preserve">REGRESSION</w:t>
-      </w:r>
-    </w:p>
-    <w:p>
-      <w:pPr>
-        <w:spacing w:after="0" w:line="276"/>
-        <w:jc w:val="left"/>
-      </w:pPr>
-      <w:r>
-        <w:rPr>
-          <w:rFonts w:ascii="Courier New" w:cs="Courier New" w:eastAsia="Courier New" w:hAnsi="Courier New"/>
-          <w:sz w:val="18"/>
-          <w:szCs w:val="18"/>
-        </w:rPr>
-        <w:t xml:space="preserve">  /DESCRIPTIVES MEAN STDDEV CORR SIG N</w:t>
-      </w:r>
-    </w:p>
-    <w:p>
-      <w:pPr>
-        <w:spacing w:after="0" w:line="276"/>
-        <w:jc w:val="left"/>
-      </w:pPr>
-      <w:r>
-        <w:rPr>
-          <w:rFonts w:ascii="Courier New" w:cs="Courier New" w:eastAsia="Courier New" w:hAnsi="Courier New"/>
-          <w:sz w:val="18"/>
-          <w:szCs w:val="18"/>
-        </w:rPr>
-        <w:t xml:space="preserve">  /MISSING LISTWISE</w:t>
-      </w:r>
-    </w:p>
-    <w:p>
-      <w:pPr>
-        <w:spacing w:after="0" w:line="276"/>
-        <w:jc w:val="left"/>
-      </w:pPr>
-      <w:r>
-        <w:rPr>
-          <w:rFonts w:ascii="Courier New" w:cs="Courier New" w:eastAsia="Courier New" w:hAnsi="Courier New"/>
-          <w:sz w:val="18"/>
-          <w:szCs w:val="18"/>
-        </w:rPr>
-        <w:t xml:space="preserve">  /STATISTICS COEFF OUTS CI(95) R ANOVA CHANGE COLLIN TOL</w:t>
-      </w:r>
-    </w:p>
-    <w:p>
-      <w:pPr>
-        <w:spacing w:after="0" w:line="276"/>
-        <w:jc w:val="left"/>
-      </w:pPr>
-      <w:r>
-        <w:rPr>
-          <w:rFonts w:ascii="Courier New" w:cs="Courier New" w:eastAsia="Courier New" w:hAnsi="Courier New"/>
-          <w:sz w:val="18"/>
-          <w:szCs w:val="18"/>
-        </w:rPr>
-        <w:t xml:space="preserve">  /CRITERIA=PIN(.05) POUT(.10) /NOORIGIN</w:t>
-      </w:r>
-    </w:p>
-    <w:p>
-      <w:pPr>
-        <w:spacing w:after="0" w:line="276"/>
-        <w:jc w:val="left"/>
-      </w:pPr>
-      <w:r>
-        <w:rPr>
-          <w:rFonts w:ascii="Courier New" w:cs="Courier New" w:eastAsia="Courier New" w:hAnsi="Courier New"/>
-          <w:sz w:val="18"/>
-          <w:szCs w:val="18"/>
-        </w:rPr>
-        <w:t xml:space="preserve">  /DEPENDENT legitimacy</w:t>
-      </w:r>
-    </w:p>
-    <w:p>
-      <w:pPr>
-        <w:spacing w:after="0" w:line="276"/>
-        <w:jc w:val="left"/>
-      </w:pPr>
-      <w:r>
-        <w:rPr>
-          <w:rFonts w:ascii="Courier New" w:cs="Courier New" w:eastAsia="Courier New" w:hAnsi="Courier New"/>
-          <w:sz w:val="18"/>
-          <w:szCs w:val="18"/>
-        </w:rPr>
-        <w:t xml:space="preserve">  /METHOD=ENTER wellbeing</w:t>
-      </w:r>
-    </w:p>
-    <w:p>
-      <w:pPr>
-        <w:spacing w:after="0" w:line="276"/>
-        <w:jc w:val="left"/>
-      </w:pPr>
-      <w:r>
-        <w:rPr>
-          <w:rFonts w:ascii="Courier New" w:cs="Courier New" w:eastAsia="Courier New" w:hAnsi="Courier New"/>
-          <w:sz w:val="18"/>
-          <w:szCs w:val="18"/>
-        </w:rPr>
-        <w:t xml:space="preserve">  /METHOD=ENTER GIL_REC yehudi</w:t>
-      </w:r>
-    </w:p>
-    <w:p>
-      <w:pPr>
-        <w:spacing w:after="0" w:line="276"/>
-        <w:jc w:val="left"/>
-      </w:pPr>
-      <w:r>
-        <w:rPr>
-          <w:rFonts w:ascii="Courier New" w:cs="Courier New" w:eastAsia="Courier New" w:hAnsi="Courier New"/>
-          <w:sz w:val="18"/>
-          <w:szCs w:val="18"/>
-        </w:rPr>
-        <w:t xml:space="preserve">  /METHOD=ENTER knissot_n vetek_bin</w:t>
-      </w:r>
-    </w:p>
-    <w:p>
-      <w:pPr>
-        <w:spacing w:after="0" w:line="276"/>
-        <w:jc w:val="left"/>
-      </w:pPr>
-      <w:r>
-        <w:rPr>
-          <w:rFonts w:ascii="Courier New" w:cs="Courier New" w:eastAsia="Courier New" w:hAnsi="Courier New"/>
-          <w:sz w:val="18"/>
-          <w:szCs w:val="18"/>
-        </w:rPr>
-        <w:t xml:space="preserve">  /SCATTERPLOT=(*ZRESID ,*ZPRED)</w:t>
-      </w:r>
-    </w:p>
-    <w:p>
-      <w:pPr>
-        <w:spacing w:after="0" w:line="276"/>
-        <w:jc w:val="left"/>
-      </w:pPr>
-      <w:r>
-        <w:rPr>
-          <w:rFonts w:ascii="Courier New" w:cs="Courier New" w:eastAsia="Courier New" w:hAnsi="Courier New"/>
-          <w:sz w:val="18"/>
-          <w:szCs w:val="18"/>
-        </w:rPr>
-        <w:t xml:space="preserve">  /RESIDUALS HISTOGRAM(ZRESID) NORMPROB(ZRESID).</w:t>
-      </w:r>
-    </w:p>
-    <w:p>
-      <w:pPr>
-        <w:spacing w:after="0" w:line="276"/>
-        <w:jc w:val="left"/>
-      </w:pPr>
-      <w:r>
-        <w:rPr>
-          <w:rFonts w:ascii="Courier New" w:cs="Courier New" w:eastAsia="Courier New" w:hAnsi="Courier New"/>
-          <w:sz w:val="18"/>
-          <w:szCs w:val="18"/>
-        </w:rPr>
-        <w:t xml:space="preserve"/>
-      </w:r>
-    </w:p>
-    <w:p>
-      <w:pPr>
-        <w:spacing w:after="0" w:line="276"/>
-        <w:jc w:val="left"/>
-      </w:pPr>
-      <w:r>
-        <w:rPr>
-          <w:rFonts w:ascii="Courier New" w:cs="Courier New" w:eastAsia="Courier New" w:hAnsi="Courier New"/>
-          <w:sz w:val="18"/>
-          <w:szCs w:val="18"/>
-        </w:rPr>
-        <w:t xml:space="preserve">* 10. ותק באגף ולגיטימיות.</w:t>
-      </w:r>
-    </w:p>
-    <w:p>
-      <w:pPr>
-        <w:spacing w:after="0" w:line="276"/>
-        <w:jc w:val="left"/>
-      </w:pPr>
-      <w:r>
-        <w:rPr>
-          <w:rFonts w:ascii="Courier New" w:cs="Courier New" w:eastAsia="Courier New" w:hAnsi="Courier New"/>
-          <w:sz w:val="18"/>
-          <w:szCs w:val="18"/>
-        </w:rPr>
-        <w:t xml:space="preserve">ONEWAY legitimacy wellbeing BY vetek4</w:t>
-      </w:r>
-    </w:p>
-    <w:p>
-      <w:pPr>
-        <w:spacing w:after="0" w:line="276"/>
-        <w:jc w:val="left"/>
-      </w:pPr>
-      <w:r>
-        <w:rPr>
-          <w:rFonts w:ascii="Courier New" w:cs="Courier New" w:eastAsia="Courier New" w:hAnsi="Courier New"/>
-          <w:sz w:val="18"/>
-          <w:szCs w:val="18"/>
-        </w:rPr>
-        <w:t xml:space="preserve">  /STATISTICS DESCRIPTIVES HOMOGENEITY WELCH</w:t>
-      </w:r>
-    </w:p>
-    <w:p>
-      <w:pPr>
-        <w:spacing w:after="0" w:line="276"/>
-        <w:jc w:val="left"/>
-      </w:pPr>
-      <w:r>
-        <w:rPr>
-          <w:rFonts w:ascii="Courier New" w:cs="Courier New" w:eastAsia="Courier New" w:hAnsi="Courier New"/>
-          <w:sz w:val="18"/>
-          <w:szCs w:val="18"/>
-        </w:rPr>
-        <w:t xml:space="preserve">  /POSTHOC=BONFERRONI ALPHA(0.05) /MISSING ANALYSIS.</w:t>
-      </w:r>
-    </w:p>
-    <w:p>
-      <w:pPr>
-        <w:spacing w:after="0" w:line="276"/>
-        <w:jc w:val="left"/>
-      </w:pPr>
-      <w:r>
-        <w:rPr>
-          <w:rFonts w:ascii="Courier New" w:cs="Courier New" w:eastAsia="Courier New" w:hAnsi="Courier New"/>
-          <w:sz w:val="18"/>
-          <w:szCs w:val="18"/>
-        </w:rPr>
-        <w:t xml:space="preserve">T-TEST GROUPS=time_in_agaf(1 2) /VARIABLES=legitimacy wellbeing /CRITERIA=CI(.95).</w:t>
-      </w:r>
-    </w:p>
-    <w:p>
-      <w:pPr>
-        <w:spacing w:after="0" w:line="276"/>
-        <w:jc w:val="left"/>
-      </w:pPr>
-      <w:r>
-        <w:rPr>
-          <w:rFonts w:ascii="Courier New" w:cs="Courier New" w:eastAsia="Courier New" w:hAnsi="Courier New"/>
-          <w:sz w:val="18"/>
-          <w:szCs w:val="18"/>
-        </w:rPr>
-        <w:t xml:space="preserve">NONPAR CORR /VARIABLES=legitimacy wellbeing vetek4 /PRINT=SPEARMAN TWOTAIL NOSIG /MISSING=PAIRWISE.</w:t>
-      </w:r>
-    </w:p>
-    <w:p>
-      <w:pPr>
-        <w:spacing w:after="0" w:line="276"/>
-        <w:jc w:val="left"/>
-      </w:pPr>
-      <w:r>
-        <w:rPr>
-          <w:rFonts w:ascii="Courier New" w:cs="Courier New" w:eastAsia="Courier New" w:hAnsi="Courier New"/>
-          <w:sz w:val="18"/>
-          <w:szCs w:val="18"/>
-        </w:rPr>
-        <w:t xml:space="preserve"/>
-      </w:r>
-    </w:p>
-    <w:p>
-      <w:pPr>
-        <w:spacing w:after="0" w:line="276"/>
-        <w:jc w:val="left"/>
-      </w:pPr>
-      <w:r>
-        <w:rPr>
-          <w:rFonts w:ascii="Courier New" w:cs="Courier New" w:eastAsia="Courier New" w:hAnsi="Courier New"/>
-          <w:sz w:val="18"/>
-          <w:szCs w:val="18"/>
-        </w:rPr>
-        <w:t xml:space="preserve">FILTER OFF.</w:t>
-      </w:r>
-    </w:p>
-    <w:p>
-      <w:pPr>
-        <w:spacing w:after="0" w:line="276"/>
-        <w:jc w:val="left"/>
-      </w:pPr>
-      <w:r>
-        <w:rPr>
-          <w:rFonts w:ascii="Courier New" w:cs="Courier New" w:eastAsia="Courier New" w:hAnsi="Courier New"/>
-          <w:sz w:val="18"/>
-          <w:szCs w:val="18"/>
-        </w:rPr>
-        <w:t xml:space="preserve">USE ALL.</w:t>
-      </w:r>
-    </w:p>
-    <w:p>
-      <w:pPr>
-        <w:spacing w:after="0" w:line="276"/>
-        <w:jc w:val="left"/>
-      </w:pPr>
-      <w:r>
-        <w:rPr>
-          <w:rFonts w:ascii="Courier New" w:cs="Courier New" w:eastAsia="Courier New" w:hAnsi="Courier New"/>
-          <w:sz w:val="18"/>
-          <w:szCs w:val="18"/>
-        </w:rPr>
-        <w:t xml:space="preserve">EXECUTE.</w:t>
-      </w:r>
-    </w:p>
     <w:sectPr>
       <w:footerReference w:type="default" r:id="rId7"/>
       <w:pgSz w:w="11906" w:h="16838" w:orient="portrait"/>

</xml_diff>